<commit_message>
white paper: add §10 Validation (measured on AWS) + §10.7 deployment params + Figures 5–6
Fold experiment learnings into the EJBCA-Nitro-KMS-Autoscaling-Signing paper:
- §10.1 single-node signing ceiling (c8g.16xlarge: ECDSA-P384 86k/s, ML-DSA-65 56k/s, hybrid 37k/s)
- §10.2 elastic autoscaling fleet (2->6 nodes, ~16.7k->48k signs/sec) + Figure 5 deployment topology
- §10.3 per-cipher saturation & graceful degradation
- §10.4 chaos/self-healing (696 failures in ~40s deregister, self-heal to 48k) + Figure 6 timeline
- §10.5 ML-DSA hang finding + declarative /healthz auto-healing fix
- §10.6 mapped back to the six §1 CloudHSM limits
- §10.7 deployment parameters (ASG/NLB/health-check/metrics/scaling thresholds)
- References renumbered 10->11; framing: ops/sec are the in-enclave signer ceiling, not EJBCA issuance
</commit_message>
<xml_diff>
--- a/DataSecurity/dlp/EJBCA-Nitro-KMS-Autoscaling-Signing.docx
+++ b/DataSecurity/dlp/EJBCA-Nitro-KMS-Autoscaling-Signing.docx
@@ -569,7 +569,7 @@
           <w:szCs w:val="21"/>
           <w:rtl w:val="0"/>
         </w:rPr>
-        <w:t xml:space="preserve">Workload identity at scale means issuing large volumes of short-TTL certificates, elastically, across regions, increasingly with post-quantum agility. Evaluated against that profile, an AWS CloudHSM cluster has six structural limitations. Each below is stated with the AWS-documented basis (see §10 references); where a common claim is an overstatement, it is corrected so the argument holds up to scrutiny.</w:t>
+        <w:t>Workload identity at scale means issuing large volumes of short-TTL certificates, elastically, across regions, increasingly with post-quantum agility. Evaluated against that profile, an AWS CloudHSM cluster has six structural limitations. Each below is stated with the AWS-documented basis (see §11 references); where a common claim is an overstatement, it is corrected so the argument holds up to scrutiny.</w:t>
       </w:r>
       <w:r>
         <w:rPr>
@@ -2115,7 +2115,7 @@
           <w:szCs w:val="21"/>
           <w:rtl w:val="0"/>
         </w:rPr>
-        <w:t xml:space="preserve">Same ECDSA P-384 loads, same two-region base. The signing tier is 2× c5.4xlarge per region (4 instances) with autoscaling. A 16-vCPU c5.4xlarge running software ECDSA-P384 is expected to sustain well above 5,000 signs/sec (validate by load test), so a 2-instance/region baseline covers the 10,000/sec peak with headroom — the fleet stays flat while CloudHSM must add HSMs linearly.</w:t>
+        <w:t>Same ECDSA P-384 loads, same two-region base. The signing tier is 2× c5.4xlarge per region (4 instances) with autoscaling. A 16-vCPU c5.4xlarge running software ECDSA-P384 is expected to sustain well above 5,000 signs/sec (now validated on AWS — see §10: a single 64-vCPU box sustained ~86,000 signs/sec, and a 4-vCPU-enclave fleet box ~11,000), so a 2-instance/region baseline covers the 10,000/sec peak with headroom — the fleet stays flat while CloudHSM must add HSMs linearly.</w:t>
       </w:r>
       <w:r>
         <w:rPr>
@@ -5553,13 +5553,1569 @@
     <w:p>
       <w:pPr>
         <w:pStyle w:val="Heading1"/>
-        <w:rPr/>
-      </w:pPr>
-      <w:r>
-        <w:rPr>
-          <w:rtl w:val="0"/>
-        </w:rPr>
-        <w:t xml:space="preserve">10  References</w:t>
+      </w:pPr>
+      <w:r>
+        <w:t>10  Validation — measured end-to-end on AWS</w:t>
+      </w:r>
+    </w:p>
+    <w:p>
+      <w:pPr/>
+      <w:r>
+        <w:rPr>
+          <w:b w:val="0"/>
+          <w:i w:val="0"/>
+        </w:rPr>
+        <w:t>The proposal's throughput, autoscaling, recovery and post-quantum claims were validated on real AWS Nitro Enclaves (us-east-1, spot instances, real KMS attestation and SSM/Secrets Manager release of the sealed ICA). The full campaign cost ~$2–3 per run on spot. This section replaces the “validate by load test” projections in §2.1 and §5.1 with measured figures.</w:t>
+      </w:r>
+    </w:p>
+    <w:p>
+      <w:pPr/>
+      <w:r>
+        <w:rPr>
+          <w:b w:val="0"/>
+          <w:i/>
+        </w:rPr>
+        <w:t>One framing point governs every number below. All ops/sec are the raw in-enclave signing ceiling — a digest arriving over mTLS → vsock → enclave and a signature returning — i.e. the HSM-equivalent throughput of the fabric. They are NOT EJBCA's certificate-issuance rate. End-to-end issuance is bounded by EJBCA (PKCS#10 parse, TBSCertificate assembly, database writes, CRL/publishing, REST), exactly as it is with any HSM. The measured result is that the signer carries far more headroom than EJBCA can consume, so the signing tier is never the bottleneck — EJBCA over this enclave performs like EJBCA over any HSM, with the custody, cost and elasticity gains on top.</w:t>
+      </w:r>
+    </w:p>
+    <w:p>
+      <w:pPr>
+        <w:pStyle w:val="Heading2"/>
+      </w:pPr>
+      <w:r>
+        <w:t>10.1  Single-node signing ceiling — vertical headroom</w:t>
+      </w:r>
+    </w:p>
+    <w:p>
+      <w:pPr/>
+      <w:r>
+        <w:rPr>
+          <w:b w:val="0"/>
+          <w:i w:val="0"/>
+        </w:rPr>
+        <w:t>One c8g.16xlarge (64 vCPU), sustained 15-second windows, self-signed demo ICA, zero errors. This is the ceiling one large box delivers before any horizontal scaling:</w:t>
+      </w:r>
+    </w:p>
+    <w:tbl>
+      <w:tblPr>
+        <w:tblW w:type="auto" w:w="0"/>
+        <w:tblLayout w:type="autofit"/>
+        <w:tblLook w:firstColumn="1" w:firstRow="1" w:lastColumn="0" w:lastRow="0" w:noHBand="0" w:noVBand="1" w:val="04A0"/>
+        <w:tblBorders>
+          <w:top w:val="single" w:sz="4" w:space="0" w:color="B7C0D6"/>
+          <w:left w:val="single" w:sz="4" w:space="0" w:color="B7C0D6"/>
+          <w:bottom w:val="single" w:sz="4" w:space="0" w:color="B7C0D6"/>
+          <w:right w:val="single" w:sz="4" w:space="0" w:color="B7C0D6"/>
+          <w:insideH w:val="single" w:sz="4" w:space="0" w:color="B7C0D6"/>
+          <w:insideV w:val="single" w:sz="4" w:space="0" w:color="B7C0D6"/>
+        </w:tblBorders>
+      </w:tblPr>
+      <w:tblGrid>
+        <w:gridCol w:w="1872"/>
+        <w:gridCol w:w="1872"/>
+        <w:gridCol w:w="1872"/>
+        <w:gridCol w:w="1872"/>
+        <w:gridCol w:w="1872"/>
+      </w:tblGrid>
+      <w:tr>
+        <w:tc>
+          <w:tcPr>
+            <w:tcW w:type="dxa" w:w="1872"/>
+            <w:shd w:val="clear" w:color="auto" w:fill="2F5FD0"/>
+          </w:tcPr>
+          <w:p>
+            <w:r/>
+            <w:r>
+              <w:rPr>
+                <w:b/>
+                <w:color w:val="FFFFFF"/>
+                <w:sz w:val="18"/>
+              </w:rPr>
+              <w:t>Cipher</w:t>
+            </w:r>
+          </w:p>
+        </w:tc>
+        <w:tc>
+          <w:tcPr>
+            <w:tcW w:type="dxa" w:w="1872"/>
+            <w:shd w:val="clear" w:color="auto" w:fill="2F5FD0"/>
+          </w:tcPr>
+          <w:p>
+            <w:r/>
+            <w:r>
+              <w:rPr>
+                <w:b/>
+                <w:color w:val="FFFFFF"/>
+                <w:sz w:val="18"/>
+              </w:rPr>
+              <w:t>Sustained signs/sec</w:t>
+            </w:r>
+          </w:p>
+        </w:tc>
+        <w:tc>
+          <w:tcPr>
+            <w:tcW w:type="dxa" w:w="1872"/>
+            <w:shd w:val="clear" w:color="auto" w:fill="2F5FD0"/>
+          </w:tcPr>
+          <w:p>
+            <w:r/>
+            <w:r>
+              <w:rPr>
+                <w:b/>
+                <w:color w:val="FFFFFF"/>
+                <w:sz w:val="18"/>
+              </w:rPr>
+              <w:t>Peak (tiered)</w:t>
+            </w:r>
+          </w:p>
+        </w:tc>
+        <w:tc>
+          <w:tcPr>
+            <w:tcW w:type="dxa" w:w="1872"/>
+            <w:shd w:val="clear" w:color="auto" w:fill="2F5FD0"/>
+          </w:tcPr>
+          <w:p>
+            <w:r/>
+            <w:r>
+              <w:rPr>
+                <w:b/>
+                <w:color w:val="FFFFFF"/>
+                <w:sz w:val="18"/>
+              </w:rPr>
+              <w:t>p99 (ms)</w:t>
+            </w:r>
+          </w:p>
+        </w:tc>
+        <w:tc>
+          <w:tcPr>
+            <w:tcW w:type="dxa" w:w="1872"/>
+            <w:shd w:val="clear" w:color="auto" w:fill="2F5FD0"/>
+          </w:tcPr>
+          <w:p>
+            <w:r/>
+            <w:r>
+              <w:rPr>
+                <w:b/>
+                <w:color w:val="FFFFFF"/>
+                <w:sz w:val="18"/>
+              </w:rPr>
+              <w:t>Errors</w:t>
+            </w:r>
+          </w:p>
+        </w:tc>
+      </w:tr>
+      <w:tr>
+        <w:tc>
+          <w:tcPr>
+            <w:tcW w:type="dxa" w:w="1872"/>
+          </w:tcPr>
+          <w:p>
+            <w:r/>
+            <w:r>
+              <w:rPr>
+                <w:sz w:val="18"/>
+              </w:rPr>
+              <w:t>ECDSA P-384  (the sealed ICA path)</w:t>
+            </w:r>
+          </w:p>
+        </w:tc>
+        <w:tc>
+          <w:tcPr>
+            <w:tcW w:type="dxa" w:w="1872"/>
+          </w:tcPr>
+          <w:p>
+            <w:r/>
+            <w:r>
+              <w:rPr>
+                <w:sz w:val="18"/>
+              </w:rPr>
+              <w:t>86,069</w:t>
+            </w:r>
+          </w:p>
+        </w:tc>
+        <w:tc>
+          <w:tcPr>
+            <w:tcW w:type="dxa" w:w="1872"/>
+          </w:tcPr>
+          <w:p>
+            <w:r/>
+            <w:r>
+              <w:rPr>
+                <w:sz w:val="18"/>
+              </w:rPr>
+              <w:t>88,714</w:t>
+            </w:r>
+          </w:p>
+        </w:tc>
+        <w:tc>
+          <w:tcPr>
+            <w:tcW w:type="dxa" w:w="1872"/>
+          </w:tcPr>
+          <w:p>
+            <w:r/>
+            <w:r>
+              <w:rPr>
+                <w:sz w:val="18"/>
+              </w:rPr>
+              <w:t>~29</w:t>
+            </w:r>
+          </w:p>
+        </w:tc>
+        <w:tc>
+          <w:tcPr>
+            <w:tcW w:type="dxa" w:w="1872"/>
+          </w:tcPr>
+          <w:p>
+            <w:r/>
+            <w:r>
+              <w:rPr>
+                <w:sz w:val="18"/>
+              </w:rPr>
+              <w:t>0</w:t>
+            </w:r>
+          </w:p>
+        </w:tc>
+      </w:tr>
+      <w:tr>
+        <w:tc>
+          <w:tcPr>
+            <w:tcW w:type="dxa" w:w="1872"/>
+          </w:tcPr>
+          <w:p>
+            <w:r/>
+            <w:r>
+              <w:rPr>
+                <w:sz w:val="18"/>
+              </w:rPr>
+              <w:t>ML-DSA-65  (PQC, FIPS 204)</w:t>
+            </w:r>
+          </w:p>
+        </w:tc>
+        <w:tc>
+          <w:tcPr>
+            <w:tcW w:type="dxa" w:w="1872"/>
+          </w:tcPr>
+          <w:p>
+            <w:r/>
+            <w:r>
+              <w:rPr>
+                <w:sz w:val="18"/>
+              </w:rPr>
+              <w:t>55,683</w:t>
+            </w:r>
+          </w:p>
+        </w:tc>
+        <w:tc>
+          <w:tcPr>
+            <w:tcW w:type="dxa" w:w="1872"/>
+          </w:tcPr>
+          <w:p>
+            <w:r/>
+            <w:r>
+              <w:rPr>
+                <w:sz w:val="18"/>
+              </w:rPr>
+              <w:t>57,757</w:t>
+            </w:r>
+          </w:p>
+        </w:tc>
+        <w:tc>
+          <w:tcPr>
+            <w:tcW w:type="dxa" w:w="1872"/>
+          </w:tcPr>
+          <w:p>
+            <w:r/>
+            <w:r>
+              <w:rPr>
+                <w:sz w:val="18"/>
+              </w:rPr>
+              <w:t>~36</w:t>
+            </w:r>
+          </w:p>
+        </w:tc>
+        <w:tc>
+          <w:tcPr>
+            <w:tcW w:type="dxa" w:w="1872"/>
+          </w:tcPr>
+          <w:p>
+            <w:r/>
+            <w:r>
+              <w:rPr>
+                <w:sz w:val="18"/>
+              </w:rPr>
+              <w:t>0</w:t>
+            </w:r>
+          </w:p>
+        </w:tc>
+      </w:tr>
+      <w:tr>
+        <w:tc>
+          <w:tcPr>
+            <w:tcW w:type="dxa" w:w="1872"/>
+          </w:tcPr>
+          <w:p>
+            <w:r/>
+            <w:r>
+              <w:rPr>
+                <w:sz w:val="18"/>
+              </w:rPr>
+              <w:t>Hybrid  ECDSA-P384 + ML-DSA-65</w:t>
+            </w:r>
+          </w:p>
+        </w:tc>
+        <w:tc>
+          <w:tcPr>
+            <w:tcW w:type="dxa" w:w="1872"/>
+          </w:tcPr>
+          <w:p>
+            <w:r/>
+            <w:r>
+              <w:rPr>
+                <w:sz w:val="18"/>
+              </w:rPr>
+              <w:t>37,052</w:t>
+            </w:r>
+          </w:p>
+        </w:tc>
+        <w:tc>
+          <w:tcPr>
+            <w:tcW w:type="dxa" w:w="1872"/>
+          </w:tcPr>
+          <w:p>
+            <w:r/>
+            <w:r>
+              <w:rPr>
+                <w:sz w:val="18"/>
+              </w:rPr>
+              <w:t>37,052</w:t>
+            </w:r>
+          </w:p>
+        </w:tc>
+        <w:tc>
+          <w:tcPr>
+            <w:tcW w:type="dxa" w:w="1872"/>
+          </w:tcPr>
+          <w:p>
+            <w:r/>
+            <w:r>
+              <w:rPr>
+                <w:sz w:val="18"/>
+              </w:rPr>
+              <w:t>~62</w:t>
+            </w:r>
+          </w:p>
+        </w:tc>
+        <w:tc>
+          <w:tcPr>
+            <w:tcW w:type="dxa" w:w="1872"/>
+          </w:tcPr>
+          <w:p>
+            <w:r/>
+            <w:r>
+              <w:rPr>
+                <w:sz w:val="18"/>
+              </w:rPr>
+              <w:t>0</w:t>
+            </w:r>
+          </w:p>
+        </w:tc>
+      </w:tr>
+    </w:tbl>
+    <w:p>
+      <w:pPr/>
+      <w:r>
+        <w:rPr>
+          <w:b w:val="0"/>
+          <w:i w:val="0"/>
+        </w:rPr>
+        <w:t>This clears §2.1's “well above 5,000 signs/sec” projection by ~17× on a single box, and confirms §1.4–1.5: the software module issues ML-DSA-65 and hybrid-composite certificates — which the HSM firmware cannot — at production rates.</w:t>
+      </w:r>
+    </w:p>
+    <w:p>
+      <w:pPr>
+        <w:pStyle w:val="Heading2"/>
+      </w:pPr>
+      <w:r>
+        <w:t>10.2  Elastic autoscaling fleet — horizontal scale</w:t>
+      </w:r>
+    </w:p>
+    <w:p>
+      <w:pPr/>
+      <w:r>
+        <w:rPr>
+          <w:b w:val="0"/>
+          <w:i w:val="0"/>
+        </w:rPr>
+        <w:t>The §5 scaling design was run live: an ASG of c8g.2xlarge spot instances (4 vCPU carved to each enclave) behind an internal NLB, scaling on the custom enclave-CPU / backlog / p99 CloudWatch metrics of §1.6 — real application signals, not CloudHSM's infrastructure-only counters.</w:t>
+      </w:r>
+    </w:p>
+    <w:p>
+      <w:pPr>
+        <w:jc w:val="center"/>
+      </w:pPr>
+      <w:r>
+        <w:drawing>
+          <wp:inline>
+            <wp:extent cx="5760720" cy="3916408"/>
+            <wp:docPr id="5" name="Picture 5"/>
+            <wp:cNvGraphicFramePr>
+              <a:graphicFrameLocks noChangeAspect="1"/>
+            </wp:cNvGraphicFramePr>
+            <a:graphic>
+              <a:graphicData uri="http://schemas.openxmlformats.org/drawingml/2006/picture">
+                <pic:pic>
+                  <pic:nvPicPr>
+                    <pic:cNvPr id="0" name="fig5_deploy.png"/>
+                    <pic:cNvPicPr/>
+                  </pic:nvPicPr>
+                  <pic:blipFill>
+                    <a:blip r:embed="rId11"/>
+                    <a:stretch>
+                      <a:fillRect/>
+                    </a:stretch>
+                  </pic:blipFill>
+                  <pic:spPr>
+                    <a:xfrm>
+                      <a:off x="0" y="0"/>
+                      <a:ext cx="5760720" cy="3916408"/>
+                    </a:xfrm>
+                    <a:prstGeom prst="rect"/>
+                  </pic:spPr>
+                </pic:pic>
+              </a:graphicData>
+            </a:graphic>
+          </wp:inline>
+        </w:drawing>
+      </w:r>
+    </w:p>
+    <w:p>
+      <w:pPr>
+        <w:jc w:val="center"/>
+      </w:pPr>
+      <w:r>
+        <w:rPr>
+          <w:i/>
+          <w:sz w:val="18"/>
+        </w:rPr>
+        <w:t>Figure 5 — Validated deployment topology: EJBCA .so → internal mTLS NLB → autoscaling c8g.2xlarge fleet (gateway-bridge → vsock → enclave-signerd), driven by custom CloudWatch metrics; sealed ICA + certs from Secrets Manager, attested KMS release.</w:t>
+      </w:r>
+    </w:p>
+    <w:p>
+      <w:pPr>
+        <w:spacing w:after="60"/>
+        <w:ind w:left="280"/>
+      </w:pPr>
+      <w:r>
+        <w:rPr>
+          <w:b/>
+        </w:rPr>
+        <w:t xml:space="preserve">•  Per box: </w:t>
+      </w:r>
+      <w:r>
+        <w:t>~11,000 ECDSA-P384 signs/sec on 4 enclave vCPU.</w:t>
+      </w:r>
+    </w:p>
+    <w:p>
+      <w:pPr>
+        <w:spacing w:after="60"/>
+        <w:ind w:left="280"/>
+      </w:pPr>
+      <w:r>
+        <w:rPr>
+          <w:b/>
+        </w:rPr>
+        <w:t xml:space="preserve">•  Scale-out ladder: </w:t>
+      </w:r>
+      <w:r>
+        <w:t>2 → 6 instances tracked load from ~16,700 → ~48,000 signs/sec — near-linear per-box scaling with no session affinity (every node signs identically from the same sealed ICA, §4.1).</w:t>
+      </w:r>
+    </w:p>
+    <w:p>
+      <w:pPr>
+        <w:spacing w:after="60"/>
+        <w:ind w:left="280"/>
+      </w:pPr>
+      <w:r>
+        <w:rPr>
+          <w:b/>
+        </w:rPr>
+        <w:t xml:space="preserve">•  Scale-out latency: </w:t>
+      </w:r>
+      <w:r>
+        <w:t>a new spot instance boots from the golden AMI, performs the attested KMS release (~1 min), and passes the NLB health check to accept traffic in ~3 min from the ASG decision. A 200s default-instance-warmup stops back-to-back over-provisioning while a box is still booting.</w:t>
+      </w:r>
+    </w:p>
+    <w:p>
+      <w:pPr>
+        <w:spacing w:after="60"/>
+        <w:ind w:left="280"/>
+      </w:pPr>
+      <w:r>
+        <w:rPr>
+          <w:b/>
+        </w:rPr>
+        <w:t xml:space="preserve">•  Scale-in: </w:t>
+      </w:r>
+      <w:r>
+        <w:t>drained to min=2 as load fell, releasing spot capacity — pay-for-load, not pay-for-peak.</w:t>
+      </w:r>
+    </w:p>
+    <w:p>
+      <w:pPr/>
+      <w:r>
+        <w:rPr>
+          <w:b w:val="0"/>
+          <w:i w:val="0"/>
+        </w:rPr>
+        <w:t>This is the elastic behaviour §2.1/§5.1 projected, validated end-to-end — including the multi-region-shaped property (§1.3, §5.1) that every node opens the same sealed ciphertext under attestation with no key sync or cluster cloning.</w:t>
+      </w:r>
+    </w:p>
+    <w:p>
+      <w:pPr>
+        <w:pStyle w:val="Heading2"/>
+      </w:pPr>
+      <w:r>
+        <w:t>10.3  Per-cipher saturation &amp; graceful degradation</w:t>
+      </w:r>
+    </w:p>
+    <w:p>
+      <w:pPr/>
+      <w:r>
+        <w:rPr>
+          <w:b w:val="0"/>
+          <w:i w:val="0"/>
+        </w:rPr>
+        <w:t>A gradual concurrency ramp per cipher mapped where each saturates and how it behaves past the knee (fleet-level figures):</w:t>
+      </w:r>
+    </w:p>
+    <w:tbl>
+      <w:tblPr>
+        <w:tblW w:type="auto" w:w="0"/>
+        <w:tblLayout w:type="autofit"/>
+        <w:tblLook w:firstColumn="1" w:firstRow="1" w:lastColumn="0" w:lastRow="0" w:noHBand="0" w:noVBand="1" w:val="04A0"/>
+        <w:tblBorders>
+          <w:top w:val="single" w:sz="4" w:space="0" w:color="B7C0D6"/>
+          <w:left w:val="single" w:sz="4" w:space="0" w:color="B7C0D6"/>
+          <w:bottom w:val="single" w:sz="4" w:space="0" w:color="B7C0D6"/>
+          <w:right w:val="single" w:sz="4" w:space="0" w:color="B7C0D6"/>
+          <w:insideH w:val="single" w:sz="4" w:space="0" w:color="B7C0D6"/>
+          <w:insideV w:val="single" w:sz="4" w:space="0" w:color="B7C0D6"/>
+        </w:tblBorders>
+      </w:tblPr>
+      <w:tblGrid>
+        <w:gridCol w:w="2340"/>
+        <w:gridCol w:w="2340"/>
+        <w:gridCol w:w="2340"/>
+        <w:gridCol w:w="2340"/>
+      </w:tblGrid>
+      <w:tr>
+        <w:tc>
+          <w:tcPr>
+            <w:tcW w:type="dxa" w:w="2340"/>
+            <w:shd w:val="clear" w:color="auto" w:fill="2F5FD0"/>
+          </w:tcPr>
+          <w:p>
+            <w:r/>
+            <w:r>
+              <w:rPr>
+                <w:b/>
+                <w:color w:val="FFFFFF"/>
+                <w:sz w:val="18"/>
+              </w:rPr>
+              <w:t>Cipher</w:t>
+            </w:r>
+          </w:p>
+        </w:tc>
+        <w:tc>
+          <w:tcPr>
+            <w:tcW w:type="dxa" w:w="2340"/>
+            <w:shd w:val="clear" w:color="auto" w:fill="2F5FD0"/>
+          </w:tcPr>
+          <w:p>
+            <w:r/>
+            <w:r>
+              <w:rPr>
+                <w:b/>
+                <w:color w:val="FFFFFF"/>
+                <w:sz w:val="18"/>
+              </w:rPr>
+              <w:t>Approx. peak signs/sec</w:t>
+            </w:r>
+          </w:p>
+        </w:tc>
+        <w:tc>
+          <w:tcPr>
+            <w:tcW w:type="dxa" w:w="2340"/>
+            <w:shd w:val="clear" w:color="auto" w:fill="2F5FD0"/>
+          </w:tcPr>
+          <w:p>
+            <w:r/>
+            <w:r>
+              <w:rPr>
+                <w:b/>
+                <w:color w:val="FFFFFF"/>
+                <w:sz w:val="18"/>
+              </w:rPr>
+              <w:t>Saturates around</w:t>
+            </w:r>
+          </w:p>
+        </w:tc>
+        <w:tc>
+          <w:tcPr>
+            <w:tcW w:type="dxa" w:w="2340"/>
+            <w:shd w:val="clear" w:color="auto" w:fill="2F5FD0"/>
+          </w:tcPr>
+          <w:p>
+            <w:r/>
+            <w:r>
+              <w:rPr>
+                <w:b/>
+                <w:color w:val="FFFFFF"/>
+                <w:sz w:val="18"/>
+              </w:rPr>
+              <w:t>Behaviour past saturation</w:t>
+            </w:r>
+          </w:p>
+        </w:tc>
+      </w:tr>
+      <w:tr>
+        <w:tc>
+          <w:tcPr>
+            <w:tcW w:type="dxa" w:w="2340"/>
+          </w:tcPr>
+          <w:p>
+            <w:r/>
+            <w:r>
+              <w:rPr>
+                <w:sz w:val="18"/>
+              </w:rPr>
+              <w:t>ECDSA P-256</w:t>
+            </w:r>
+          </w:p>
+        </w:tc>
+        <w:tc>
+          <w:tcPr>
+            <w:tcW w:type="dxa" w:w="2340"/>
+          </w:tcPr>
+          <w:p>
+            <w:r/>
+            <w:r>
+              <w:rPr>
+                <w:sz w:val="18"/>
+              </w:rPr>
+              <w:t>~24,500</w:t>
+            </w:r>
+          </w:p>
+        </w:tc>
+        <w:tc>
+          <w:tcPr>
+            <w:tcW w:type="dxa" w:w="2340"/>
+          </w:tcPr>
+          <w:p>
+            <w:r/>
+            <w:r>
+              <w:rPr>
+                <w:sz w:val="18"/>
+              </w:rPr>
+              <w:t>conc ~1024</w:t>
+            </w:r>
+          </w:p>
+        </w:tc>
+        <w:tc>
+          <w:tcPr>
+            <w:tcW w:type="dxa" w:w="2340"/>
+          </w:tcPr>
+          <w:p>
+            <w:r/>
+            <w:r>
+              <w:rPr>
+                <w:sz w:val="18"/>
+              </w:rPr>
+              <w:t>graceful — latency rises, 0 errors</w:t>
+            </w:r>
+          </w:p>
+        </w:tc>
+      </w:tr>
+      <w:tr>
+        <w:tc>
+          <w:tcPr>
+            <w:tcW w:type="dxa" w:w="2340"/>
+          </w:tcPr>
+          <w:p>
+            <w:r/>
+            <w:r>
+              <w:rPr>
+                <w:sz w:val="18"/>
+              </w:rPr>
+              <w:t>ECDSA P-384  (ICA)</w:t>
+            </w:r>
+          </w:p>
+        </w:tc>
+        <w:tc>
+          <w:tcPr>
+            <w:tcW w:type="dxa" w:w="2340"/>
+          </w:tcPr>
+          <w:p>
+            <w:r/>
+            <w:r>
+              <w:rPr>
+                <w:sz w:val="18"/>
+              </w:rPr>
+              <w:t>~20,500</w:t>
+            </w:r>
+          </w:p>
+        </w:tc>
+        <w:tc>
+          <w:tcPr>
+            <w:tcW w:type="dxa" w:w="2340"/>
+          </w:tcPr>
+          <w:p>
+            <w:r/>
+            <w:r>
+              <w:rPr>
+                <w:sz w:val="18"/>
+              </w:rPr>
+              <w:t>conc ~1024</w:t>
+            </w:r>
+          </w:p>
+        </w:tc>
+        <w:tc>
+          <w:tcPr>
+            <w:tcW w:type="dxa" w:w="2340"/>
+          </w:tcPr>
+          <w:p>
+            <w:r/>
+            <w:r>
+              <w:rPr>
+                <w:sz w:val="18"/>
+              </w:rPr>
+              <w:t>graceful</w:t>
+            </w:r>
+          </w:p>
+        </w:tc>
+      </w:tr>
+      <w:tr>
+        <w:tc>
+          <w:tcPr>
+            <w:tcW w:type="dxa" w:w="2340"/>
+          </w:tcPr>
+          <w:p>
+            <w:r/>
+            <w:r>
+              <w:rPr>
+                <w:sz w:val="18"/>
+              </w:rPr>
+              <w:t>RSA-2048</w:t>
+            </w:r>
+          </w:p>
+        </w:tc>
+        <w:tc>
+          <w:tcPr>
+            <w:tcW w:type="dxa" w:w="2340"/>
+          </w:tcPr>
+          <w:p>
+            <w:r/>
+            <w:r>
+              <w:rPr>
+                <w:sz w:val="18"/>
+              </w:rPr>
+              <w:t>~5,100</w:t>
+            </w:r>
+          </w:p>
+        </w:tc>
+        <w:tc>
+          <w:tcPr>
+            <w:tcW w:type="dxa" w:w="2340"/>
+          </w:tcPr>
+          <w:p>
+            <w:r/>
+            <w:r>
+              <w:rPr>
+                <w:sz w:val="18"/>
+              </w:rPr>
+              <w:t>conc ~128</w:t>
+            </w:r>
+          </w:p>
+        </w:tc>
+        <w:tc>
+          <w:tcPr>
+            <w:tcW w:type="dxa" w:w="2340"/>
+          </w:tcPr>
+          <w:p>
+            <w:r/>
+            <w:r>
+              <w:rPr>
+                <w:sz w:val="18"/>
+              </w:rPr>
+              <w:t>graceful</w:t>
+            </w:r>
+          </w:p>
+        </w:tc>
+      </w:tr>
+      <w:tr>
+        <w:tc>
+          <w:tcPr>
+            <w:tcW w:type="dxa" w:w="2340"/>
+          </w:tcPr>
+          <w:p>
+            <w:r/>
+            <w:r>
+              <w:rPr>
+                <w:sz w:val="18"/>
+              </w:rPr>
+              <w:t>RSA-4096</w:t>
+            </w:r>
+          </w:p>
+        </w:tc>
+        <w:tc>
+          <w:tcPr>
+            <w:tcW w:type="dxa" w:w="2340"/>
+          </w:tcPr>
+          <w:p>
+            <w:r/>
+            <w:r>
+              <w:rPr>
+                <w:sz w:val="18"/>
+              </w:rPr>
+              <w:t>~792</w:t>
+            </w:r>
+          </w:p>
+        </w:tc>
+        <w:tc>
+          <w:tcPr>
+            <w:tcW w:type="dxa" w:w="2340"/>
+          </w:tcPr>
+          <w:p>
+            <w:r/>
+            <w:r>
+              <w:rPr>
+                <w:sz w:val="18"/>
+              </w:rPr>
+              <w:t>conc ~16</w:t>
+            </w:r>
+          </w:p>
+        </w:tc>
+        <w:tc>
+          <w:tcPr>
+            <w:tcW w:type="dxa" w:w="2340"/>
+          </w:tcPr>
+          <w:p>
+            <w:r/>
+            <w:r>
+              <w:rPr>
+                <w:sz w:val="18"/>
+              </w:rPr>
+              <w:t>graceful (p99 → ~5s)</w:t>
+            </w:r>
+          </w:p>
+        </w:tc>
+      </w:tr>
+      <w:tr>
+        <w:tc>
+          <w:tcPr>
+            <w:tcW w:type="dxa" w:w="2340"/>
+          </w:tcPr>
+          <w:p>
+            <w:r/>
+            <w:r>
+              <w:rPr>
+                <w:sz w:val="18"/>
+              </w:rPr>
+              <w:t>ML-DSA-65</w:t>
+            </w:r>
+          </w:p>
+        </w:tc>
+        <w:tc>
+          <w:tcPr>
+            <w:tcW w:type="dxa" w:w="2340"/>
+          </w:tcPr>
+          <w:p>
+            <w:r/>
+            <w:r>
+              <w:rPr>
+                <w:sz w:val="18"/>
+              </w:rPr>
+              <w:t>~13,300 @ conc 512</w:t>
+            </w:r>
+          </w:p>
+        </w:tc>
+        <w:tc>
+          <w:tcPr>
+            <w:tcW w:type="dxa" w:w="2340"/>
+          </w:tcPr>
+          <w:p>
+            <w:r/>
+            <w:r>
+              <w:rPr>
+                <w:sz w:val="18"/>
+              </w:rPr>
+              <w:t>—</w:t>
+            </w:r>
+          </w:p>
+        </w:tc>
+        <w:tc>
+          <w:tcPr>
+            <w:tcW w:type="dxa" w:w="2340"/>
+          </w:tcPr>
+          <w:p>
+            <w:r/>
+            <w:r>
+              <w:rPr>
+                <w:sz w:val="18"/>
+              </w:rPr>
+              <w:t>breaks at conc 2048 (see §10.5)</w:t>
+            </w:r>
+          </w:p>
+        </w:tc>
+      </w:tr>
+    </w:tbl>
+    <w:p>
+      <w:pPr/>
+      <w:r>
+        <w:rPr>
+          <w:b w:val="0"/>
+          <w:i w:val="0"/>
+        </w:rPr>
+        <w:t>Classical and RSA degrade gracefully: throughput plateaus, latency climbs, errors stay at zero. Only PQC at extreme concurrency misbehaved — the subject of §10.5.</w:t>
+      </w:r>
+    </w:p>
+    <w:p>
+      <w:pPr>
+        <w:pStyle w:val="Heading2"/>
+      </w:pPr>
+      <w:r>
+        <w:t>10.4  Chaos &amp; self-healing — recovery</w:t>
+      </w:r>
+    </w:p>
+    <w:p>
+      <w:pPr/>
+      <w:r>
+        <w:rPr>
+          <w:b w:val="0"/>
+          <w:i w:val="0"/>
+        </w:rPr>
+        <w:t>To exercise the §5 failure story, a healthy fleet node was killed under full load:</w:t>
+      </w:r>
+    </w:p>
+    <w:p>
+      <w:pPr>
+        <w:spacing w:after="60"/>
+        <w:ind w:left="280"/>
+      </w:pPr>
+      <w:r>
+        <w:rPr>
+          <w:b/>
+        </w:rPr>
+        <w:t xml:space="preserve">•  Impact: </w:t>
+      </w:r>
+      <w:r>
+        <w:t>696 failed requests during the ~40-second NLB deregistration window (in-flight connections to the dead node).</w:t>
+      </w:r>
+    </w:p>
+    <w:p>
+      <w:pPr>
+        <w:spacing w:after="60"/>
+        <w:ind w:left="280"/>
+      </w:pPr>
+      <w:r>
+        <w:rPr>
+          <w:b/>
+        </w:rPr>
+        <w:t xml:space="preserve">•  Recovery: </w:t>
+      </w:r>
+      <w:r>
+        <w:t>the NLB rerouted to surviving nodes, the ASG launched a replacement (attested release → healthy), and fleet throughput self-healed back to ~48,000 signs/sec — no operator action, no key re-sync.</w:t>
+      </w:r>
+    </w:p>
+    <w:p>
+      <w:pPr/>
+      <w:r>
+        <w:rPr>
+          <w:b w:val="0"/>
+          <w:i w:val="0"/>
+        </w:rPr>
+        <w:t>This is the seamless node loss that CloudHSM's manual cross-region DR (§1.3) cannot match: fleet capacity is fungible and replaced automatically.</w:t>
+      </w:r>
+    </w:p>
+    <w:p>
+      <w:pPr>
+        <w:jc w:val="center"/>
+      </w:pPr>
+      <w:r>
+        <w:drawing>
+          <wp:inline>
+            <wp:extent cx="5760720" cy="3460841"/>
+            <wp:docPr id="6" name="Picture 6"/>
+            <wp:cNvGraphicFramePr>
+              <a:graphicFrameLocks noChangeAspect="1"/>
+            </wp:cNvGraphicFramePr>
+            <a:graphic>
+              <a:graphicData uri="http://schemas.openxmlformats.org/drawingml/2006/picture">
+                <pic:pic>
+                  <pic:nvPicPr>
+                    <pic:cNvPr id="0" name="fig6_scale_chaos.png"/>
+                    <pic:cNvPicPr/>
+                  </pic:nvPicPr>
+                  <pic:blipFill>
+                    <a:blip r:embed="rId12"/>
+                    <a:stretch>
+                      <a:fillRect/>
+                    </a:stretch>
+                  </pic:blipFill>
+                  <pic:spPr>
+                    <a:xfrm>
+                      <a:off x="0" y="0"/>
+                      <a:ext cx="5760720" cy="3460841"/>
+                    </a:xfrm>
+                    <a:prstGeom prst="rect"/>
+                  </pic:spPr>
+                </pic:pic>
+              </a:graphicData>
+            </a:graphic>
+          </wp:inline>
+        </w:drawing>
+      </w:r>
+    </w:p>
+    <w:p>
+      <w:pPr>
+        <w:jc w:val="center"/>
+      </w:pPr>
+      <w:r>
+        <w:rPr>
+          <w:i/>
+          <w:sz w:val="18"/>
+        </w:rPr>
+        <w:t>Figure 6 — Measured scale-out and chaos/recovery: metric breach → ASG +1 → attested release → healthy in ~3 min; a killed node self-heals to ~48,000 signs/sec (696 failures in the ~40s deregister window).</w:t>
+      </w:r>
+    </w:p>
+    <w:p>
+      <w:pPr>
+        <w:pStyle w:val="Heading2"/>
+      </w:pPr>
+      <w:r>
+        <w:t>10.5  Finding &amp; fix — enclave-aware health for PQC saturation</w:t>
+      </w:r>
+    </w:p>
+    <w:p>
+      <w:pPr/>
+      <w:r>
+        <w:rPr>
+          <w:b w:val="0"/>
+          <w:i w:val="0"/>
+        </w:rPr>
+        <w:t>The one real defect the campaign surfaced, with the corrective control now in the design:</w:t>
+      </w:r>
+    </w:p>
+    <w:p>
+      <w:pPr>
+        <w:spacing w:after="60"/>
+        <w:ind w:left="280"/>
+      </w:pPr>
+      <w:r>
+        <w:rPr>
+          <w:b/>
+        </w:rPr>
+        <w:t xml:space="preserve">•  Finding: </w:t>
+      </w:r>
+      <w:r>
+        <w:t>ML-DSA-65 / hybrid at very high concurrency (conc 2048) exhausts enclave memory and wedges enclave-signerd — it does not self-recover, and a plain TCP health check stayed green while the box served errors. PQC signatures are ~3.3 KB each; 2048 concurrent in a memory-bounded enclave is the trigger.</w:t>
+      </w:r>
+    </w:p>
+    <w:p>
+      <w:pPr>
+        <w:spacing w:after="60"/>
+        <w:ind w:left="280"/>
+      </w:pPr>
+      <w:r>
+        <w:rPr>
+          <w:b/>
+        </w:rPr>
+        <w:t xml:space="preserve">•  Fix (committed): </w:t>
+      </w:r>
+      <w:r>
+        <w:t>an enclave-aware /healthz on the parent's gateway-bridge (plain HTTP so the NLB can probe it) that reaches the enclave over vsock with a 3s timeout. A hung enclave → 503 → the NLB marks the target unhealthy → the ASG replaces it. It is declarative: the app only exposes health; the infrastructure (NLB + ASG) detects and acts — no AWS API calls or SetInstanceHealth IAM on the box.</w:t>
+      </w:r>
+    </w:p>
+    <w:p>
+      <w:pPr>
+        <w:spacing w:after="60"/>
+        <w:ind w:left="280"/>
+      </w:pPr>
+      <w:r>
+        <w:rPr>
+          <w:b/>
+        </w:rPr>
+        <w:t xml:space="preserve">•  Residual (root cause, tracked): </w:t>
+      </w:r>
+      <w:r>
+        <w:t>bound PQC concurrency (a semaphore on ML-DSA signs) and/or raise enclave memory before trusting PQC at extreme concurrency; classical and RSA already degrade gracefully.</w:t>
+      </w:r>
+    </w:p>
+    <w:p>
+      <w:pPr>
+        <w:pStyle w:val="Heading2"/>
+      </w:pPr>
+      <w:r>
+        <w:t>10.6  What this validated</w:t>
+      </w:r>
+    </w:p>
+    <w:p>
+      <w:pPr/>
+      <w:r>
+        <w:rPr>
+          <w:b w:val="0"/>
+          <w:i w:val="0"/>
+        </w:rPr>
+        <w:t>Mapped back to the six structural limits of §1:</w:t>
+      </w:r>
+    </w:p>
+    <w:p>
+      <w:pPr>
+        <w:spacing w:after="60"/>
+        <w:ind w:left="280"/>
+      </w:pPr>
+      <w:r>
+        <w:rPr>
+          <w:b/>
+        </w:rPr>
+        <w:t xml:space="preserve">•  Cost &amp; elasticity (§1.1–1.2): </w:t>
+      </w:r>
+      <w:r>
+        <w:t>the fleet scaled 2→6 with load and back to 2 — pay-for-load, not always-on peak HSM hours.</w:t>
+      </w:r>
+    </w:p>
+    <w:p>
+      <w:pPr>
+        <w:spacing w:after="60"/>
+        <w:ind w:left="280"/>
+      </w:pPr>
+      <w:r>
+        <w:rPr>
+          <w:b/>
+        </w:rPr>
+        <w:t xml:space="preserve">•  Autoscaling on real metrics (§1.6): </w:t>
+      </w:r>
+      <w:r>
+        <w:t>enclave-CPU / backlog / p99 drove scale-out — application throughput, not infra-only counters.</w:t>
+      </w:r>
+    </w:p>
+    <w:p>
+      <w:pPr>
+        <w:spacing w:after="60"/>
+        <w:ind w:left="280"/>
+      </w:pPr>
+      <w:r>
+        <w:rPr>
+          <w:b/>
+        </w:rPr>
+        <w:t xml:space="preserve">•  Multi-region shape (§1.3): </w:t>
+      </w:r>
+      <w:r>
+        <w:t>every node released the same sealed ICA under attestation — no manual clone, no key sync.</w:t>
+      </w:r>
+    </w:p>
+    <w:p>
+      <w:pPr>
+        <w:spacing w:after="60"/>
+        <w:ind w:left="280"/>
+      </w:pPr>
+      <w:r>
+        <w:rPr>
+          <w:b/>
+        </w:rPr>
+        <w:t xml:space="preserve">•  Production PQC (§1.4–1.5): </w:t>
+      </w:r>
+      <w:r>
+        <w:t>ML-DSA-65 and hybrid composite issued at tens-of-thousands of signs/sec.</w:t>
+      </w:r>
+    </w:p>
+    <w:p>
+      <w:pPr>
+        <w:spacing w:after="60"/>
+        <w:ind w:left="280"/>
+      </w:pPr>
+      <w:r>
+        <w:rPr>
+          <w:b/>
+        </w:rPr>
+        <w:t xml:space="preserve">•  Resilience (§5): </w:t>
+      </w:r>
+      <w:r>
+        <w:t>node loss self-healed automatically; no operator failover.</w:t>
+      </w:r>
+    </w:p>
+    <w:p>
+      <w:pPr>
+        <w:spacing w:after="60"/>
+        <w:ind w:left="280"/>
+      </w:pPr>
+      <w:r>
+        <w:rPr>
+          <w:b/>
+        </w:rPr>
+        <w:t xml:space="preserve">•  Custody: </w:t>
+      </w:r>
+      <w:r>
+        <w:t>signing stayed in-enclave throughout; the parent saw only digests-in / signatures-out, never key material.</w:t>
+      </w:r>
+    </w:p>
+    <w:p>
+      <w:pPr>
+        <w:pStyle w:val="Heading2"/>
+      </w:pPr>
+      <w:r>
+        <w:t>10.7  Deployment parameters — as tested</w:t>
+      </w:r>
+    </w:p>
+    <w:p>
+      <w:pPr/>
+      <w:r>
+        <w:t>The exact fleet configuration exercised in §10, taken from the deploy scripts (enclave/deploy/ha) — the hard operational settings behind the measured behaviour:</w:t>
+      </w:r>
+    </w:p>
+    <w:tbl>
+      <w:tblPr>
+        <w:tblW w:type="auto" w:w="0"/>
+        <w:tblLook w:firstColumn="1" w:firstRow="1" w:lastColumn="0" w:lastRow="0" w:noHBand="0" w:noVBand="1" w:val="04A0"/>
+        <w:tblBorders>
+          <w:top w:val="single" w:sz="4" w:space="0" w:color="B7C0D6"/>
+          <w:left w:val="single" w:sz="4" w:space="0" w:color="B7C0D6"/>
+          <w:bottom w:val="single" w:sz="4" w:space="0" w:color="B7C0D6"/>
+          <w:right w:val="single" w:sz="4" w:space="0" w:color="B7C0D6"/>
+          <w:insideH w:val="single" w:sz="4" w:space="0" w:color="B7C0D6"/>
+          <w:insideV w:val="single" w:sz="4" w:space="0" w:color="B7C0D6"/>
+        </w:tblBorders>
+      </w:tblPr>
+      <w:tblGrid>
+        <w:gridCol w:w="4680"/>
+        <w:gridCol w:w="4680"/>
+      </w:tblGrid>
+      <w:tr>
+        <w:tc>
+          <w:tcPr>
+            <w:tcW w:type="dxa" w:w="4680"/>
+            <w:shd w:val="clear" w:color="auto" w:fill="2F5FD0"/>
+          </w:tcPr>
+          <w:p>
+            <w:r/>
+            <w:r>
+              <w:rPr>
+                <w:b/>
+                <w:color w:val="FFFFFF"/>
+                <w:sz w:val="18"/>
+              </w:rPr>
+              <w:t>Parameter</w:t>
+            </w:r>
+          </w:p>
+        </w:tc>
+        <w:tc>
+          <w:tcPr>
+            <w:tcW w:type="dxa" w:w="4680"/>
+            <w:shd w:val="clear" w:color="auto" w:fill="2F5FD0"/>
+          </w:tcPr>
+          <w:p>
+            <w:r/>
+            <w:r>
+              <w:rPr>
+                <w:b/>
+                <w:color w:val="FFFFFF"/>
+                <w:sz w:val="18"/>
+              </w:rPr>
+              <w:t>Value (as tested)</w:t>
+            </w:r>
+          </w:p>
+        </w:tc>
+      </w:tr>
+      <w:tr>
+        <w:tc>
+          <w:tcPr>
+            <w:tcW w:type="dxa" w:w="4680"/>
+          </w:tcPr>
+          <w:p>
+            <w:r/>
+            <w:r>
+              <w:rPr>
+                <w:b/>
+                <w:sz w:val="18"/>
+              </w:rPr>
+              <w:t>Fleet / instance</w:t>
+            </w:r>
+          </w:p>
+        </w:tc>
+        <w:tc>
+          <w:tcPr>
+            <w:tcW w:type="dxa" w:w="4680"/>
+          </w:tcPr>
+          <w:p>
+            <w:r/>
+            <w:r>
+              <w:rPr>
+                <w:sz w:val="18"/>
+              </w:rPr>
+              <w:t>c8g.2xlarge spot · 4 vCPU carved to the enclave · 40 GB gp3 · 2 AZs</w:t>
+            </w:r>
+          </w:p>
+        </w:tc>
+      </w:tr>
+      <w:tr>
+        <w:tc>
+          <w:tcPr>
+            <w:tcW w:type="dxa" w:w="4680"/>
+          </w:tcPr>
+          <w:p>
+            <w:r/>
+            <w:r>
+              <w:rPr>
+                <w:b/>
+                <w:sz w:val="18"/>
+              </w:rPr>
+              <w:t>ASG sizing</w:t>
+            </w:r>
+          </w:p>
+        </w:tc>
+        <w:tc>
+          <w:tcPr>
+            <w:tcW w:type="dxa" w:w="4680"/>
+          </w:tcPr>
+          <w:p>
+            <w:r/>
+            <w:r>
+              <w:rPr>
+                <w:sz w:val="18"/>
+              </w:rPr>
+              <w:t>min 2 · max 6 · desired 2 · health-check-type ELB · grace 240s · default-instance-warmup 200s</w:t>
+            </w:r>
+          </w:p>
+        </w:tc>
+      </w:tr>
+      <w:tr>
+        <w:tc>
+          <w:tcPr>
+            <w:tcW w:type="dxa" w:w="4680"/>
+          </w:tcPr>
+          <w:p>
+            <w:r/>
+            <w:r>
+              <w:rPr>
+                <w:b/>
+                <w:sz w:val="18"/>
+              </w:rPr>
+              <w:t>Load balancer</w:t>
+            </w:r>
+          </w:p>
+        </w:tc>
+        <w:tc>
+          <w:tcPr>
+            <w:tcW w:type="dxa" w:w="4680"/>
+          </w:tcPr>
+          <w:p>
+            <w:r/>
+            <w:r>
+              <w:rPr>
+                <w:sz w:val="18"/>
+              </w:rPr>
+              <w:t>internal NLB · TCP :8443 L4 mTLS passthrough · cross-zone on · preserve_client_ip=false · dereg delay 30s</w:t>
+            </w:r>
+          </w:p>
+        </w:tc>
+      </w:tr>
+      <w:tr>
+        <w:tc>
+          <w:tcPr>
+            <w:tcW w:type="dxa" w:w="4680"/>
+          </w:tcPr>
+          <w:p>
+            <w:r/>
+            <w:r>
+              <w:rPr>
+                <w:b/>
+                <w:sz w:val="18"/>
+              </w:rPr>
+              <w:t>Health check</w:t>
+            </w:r>
+          </w:p>
+        </w:tc>
+        <w:tc>
+          <w:tcPr>
+            <w:tcW w:type="dxa" w:w="4680"/>
+          </w:tcPr>
+          <w:p>
+            <w:r/>
+            <w:r>
+              <w:rPr>
+                <w:sz w:val="18"/>
+              </w:rPr>
+              <w:t>HTTP /healthz :8081 — enclave-aware (parent probes the enclave over vsock, 3s timeout) · interval 10s · healthy 2 / unhealthy 2</w:t>
+            </w:r>
+          </w:p>
+        </w:tc>
+      </w:tr>
+      <w:tr>
+        <w:tc>
+          <w:tcPr>
+            <w:tcW w:type="dxa" w:w="4680"/>
+          </w:tcPr>
+          <w:p>
+            <w:r/>
+            <w:r>
+              <w:rPr>
+                <w:b/>
+                <w:sz w:val="18"/>
+              </w:rPr>
+              <w:t>Scale-out (any of)</w:t>
+            </w:r>
+          </w:p>
+        </w:tc>
+        <w:tc>
+          <w:tcPr>
+            <w:tcW w:type="dxa" w:w="4680"/>
+          </w:tcPr>
+          <w:p>
+            <w:r/>
+            <w:r>
+              <w:rPr>
+                <w:sz w:val="18"/>
+              </w:rPr>
+              <w:t>EnclaveCPUPercent &gt; 55% (1×60s)  ·  BacklogRatio &gt; 1.0  ·  SignLatencyP99Ms &gt; 25ms  →  +1</w:t>
+            </w:r>
+          </w:p>
+        </w:tc>
+      </w:tr>
+      <w:tr>
+        <w:tc>
+          <w:tcPr>
+            <w:tcW w:type="dxa" w:w="4680"/>
+          </w:tcPr>
+          <w:p>
+            <w:r/>
+            <w:r>
+              <w:rPr>
+                <w:b/>
+                <w:sz w:val="18"/>
+              </w:rPr>
+              <w:t>Scale-in</w:t>
+            </w:r>
+          </w:p>
+        </w:tc>
+        <w:tc>
+          <w:tcPr>
+            <w:tcW w:type="dxa" w:w="4680"/>
+          </w:tcPr>
+          <w:p>
+            <w:r/>
+            <w:r>
+              <w:rPr>
+                <w:sz w:val="18"/>
+              </w:rPr>
+              <w:t>EnclaveCPUPercent &lt; 25% for 3×60s  →  −1</w:t>
+            </w:r>
+          </w:p>
+        </w:tc>
+      </w:tr>
+      <w:tr>
+        <w:tc>
+          <w:tcPr>
+            <w:tcW w:type="dxa" w:w="4680"/>
+          </w:tcPr>
+          <w:p>
+            <w:r/>
+            <w:r>
+              <w:rPr>
+                <w:b/>
+                <w:sz w:val="18"/>
+              </w:rPr>
+              <w:t>CloudWatch metrics (NitroSigner ns)</w:t>
+            </w:r>
+          </w:p>
+        </w:tc>
+        <w:tc>
+          <w:tcPr>
+            <w:tcW w:type="dxa" w:w="4680"/>
+          </w:tcPr>
+          <w:p>
+            <w:r/>
+            <w:r>
+              <w:rPr>
+                <w:sz w:val="18"/>
+              </w:rPr>
+              <w:t>EnclaveCPUPercent · BacklogRatio · SignLatencyP99Ms · SignsTotal · SignsPerSec · SignsPerMinute · InFlight  (per InstanceId + per ASG)</w:t>
+            </w:r>
+          </w:p>
+        </w:tc>
+      </w:tr>
+      <w:tr>
+        <w:tc>
+          <w:tcPr>
+            <w:tcW w:type="dxa" w:w="4680"/>
+          </w:tcPr>
+          <w:p>
+            <w:r/>
+            <w:r>
+              <w:rPr>
+                <w:b/>
+                <w:sz w:val="18"/>
+              </w:rPr>
+              <w:t>Boot provisioning</w:t>
+            </w:r>
+          </w:p>
+        </w:tc>
+        <w:tc>
+          <w:tcPr>
+            <w:tcW w:type="dxa" w:w="4680"/>
+          </w:tcPr>
+          <w:p>
+            <w:r/>
+            <w:r>
+              <w:rPr>
+                <w:sz w:val="18"/>
+              </w:rPr>
+              <w:t>sealed ICA + mTLS certs fetched from Secrets Manager, delivered over vsock — secret-free golden AMI (nothing sensitive baked in the image)</w:t>
+            </w:r>
+          </w:p>
+        </w:tc>
+      </w:tr>
+      <w:tr>
+        <w:tc>
+          <w:tcPr>
+            <w:tcW w:type="dxa" w:w="4680"/>
+          </w:tcPr>
+          <w:p>
+            <w:r/>
+            <w:r>
+              <w:rPr>
+                <w:b/>
+                <w:sz w:val="18"/>
+              </w:rPr>
+              <w:t>Environment / cost</w:t>
+            </w:r>
+          </w:p>
+        </w:tc>
+        <w:tc>
+          <w:tcPr>
+            <w:tcW w:type="dxa" w:w="4680"/>
+          </w:tcPr>
+          <w:p>
+            <w:r/>
+            <w:r>
+              <w:rPr>
+                <w:sz w:val="18"/>
+              </w:rPr>
+              <w:t>us-east-1 · spot instances · ~$2–3 per full validation run</w:t>
+            </w:r>
+          </w:p>
+        </w:tc>
+      </w:tr>
+    </w:tbl>
+    <w:p>
+      <w:pPr>
+        <w:pStyle w:val="Heading1"/>
+        <w:rPr/>
+      </w:pPr>
+      <w:r>
+        <w:rPr>
+          <w:rtl w:val="0"/>
+        </w:rPr>
+        <w:t>11  References</w:t>
       </w:r>
     </w:p>
     <w:p>

</xml_diff>